<commit_message>
docs: polish contestant-facing project language
</commit_message>
<xml_diff>
--- a/提交材料/08_决赛演示与验收附件.docx
+++ b/提交材料/08_决赛演示与验收附件.docx
@@ -1443,23 +1443,7 @@
         </w:rPr>
       </w:pPr>
       <w:r>
-        <w:rPr>
-          <w:lang w:eastAsia="zh-CN"/>
-        </w:rPr>
-        <w:t>收束口径：平台</w:t>
-      </w:r>
-      <w:r>
-        <w:rPr>
-          <w:rFonts w:hint="eastAsia"/>
-          <w:lang w:eastAsia="zh-CN"/>
-        </w:rPr>
-        <w:t>并非</w:t>
-      </w:r>
-      <w:r>
-        <w:rPr>
-          <w:lang w:eastAsia="zh-CN"/>
-        </w:rPr>
-        <w:t>替代操作员的自动控制器，是把班次事实、调度判断、责任确认和执行结果串起来的工作方法。企业试点首先检验调度是否更快、更稳、更容易复盘。</w:t>
+        <w:t>我们的交付重点是把班次事实、调度判断、责任确认和执行结果放在同一条可追溯链路上，为现场班组留下可核对的依据。企业试点先用真实班次检验三件事：调度是否更快，生产是否更稳，班后是否更容易复盘。</w:t>
       </w:r>
     </w:p>
     <w:p>

</xml_diff>